<commit_message>
Registrar URL publica del sitio
</commit_message>
<xml_diff>
--- a/ServicioSocial_Actividad5_SAGT_CORREGIDA.docx
+++ b/ServicioSocial_Actividad5_SAGT_CORREGIDA.docx
@@ -520,7 +520,7 @@
             <w:pPr/>
             <w:r>
               <w:rPr/>
-              <w:t xml:space="preserve">Enlace del sitio web, capturas de pantalla, base de datos del proyecto y documento metodológico.</w:t>
+              <w:t xml:space="preserve">Enlace del sitio web publicado en https://heronrisk.github.io/pulso-ambiental-mty/, capturas de pantalla, base de datos del proyecto y documento metodológico.</w:t>
             </w:r>
           </w:p>
         </w:tc>
@@ -1128,7 +1128,7 @@
             <w:pPr/>
             <w:r>
               <w:rPr/>
-              <w:t xml:space="preserve">URL publicada y configuración de GitHub Pages.</w:t>
+              <w:t xml:space="preserve">URL publicada en https://heronrisk.github.io/pulso-ambiental-mty/ y configuración de GitHub Pages.</w:t>
             </w:r>
           </w:p>
         </w:tc>
@@ -4562,7 +4562,7 @@
       <w:pPr/>
       <w:r>
         <w:rPr/>
-        <w:t xml:space="preserve">Considero que esta planeación fortalece el proyecto porque lo hace más claro, medible y viable. Además, mantiene la intención principal de las actividades anteriores: traducir información ambiental técnica en conocimiento útil para la ciudadanía y contribuir, aunque sea desde un proyecto académico, a una mejor comprensión de la sostenibilidad en Monterrey y su área metropolitana.</w:t>
+        <w:t xml:space="preserve">Considero que esta planeación fortalece el proyecto porque lo hace más claro, medible y viable. Además, mantiene la intención principal de las actividades anteriores: traducir información ambiental técnica en conocimiento útil para la ciudadanía y contribuir, aunque sea desde un proyecto académico, a una mejor comprensión de la sostenibilidad en Monterrey y su área metropolitana. La versión publicada del sitio puede consultarse en https://heronrisk.github.io/pulso-ambiental-mty/.</w:t>
       </w:r>
     </w:p>
     <w:sectPr>

</xml_diff>